<commit_message>
docs: branch fitur dibuat dari dev dan PR mengarah ke dev
</commit_message>
<xml_diff>
--- a/Pembagian Tugas/panduan-kerja-per-anggota.docx
+++ b/Pembagian Tugas/panduan-kerja-per-anggota.docx
@@ -104,7 +104,7 @@
         <w:rPr>
           <w:rStyle w:val="VerbatimChar"/>
         </w:rPr>
-        <w:t xml:space="preserve">git switch main</w:t>
+        <w:t xml:space="preserve">git switch dev</w:t>
       </w:r>
       <w:r>
         <w:t xml:space="preserve">,</w:t>
@@ -128,7 +128,7 @@
         <w:rPr>
           <w:rStyle w:val="VerbatimChar"/>
         </w:rPr>
-        <w:t xml:space="preserve">main</w:t>
+        <w:t xml:space="preserve">dev</w:t>
       </w:r>
       <w:r>
         <w:t xml:space="preserve">.</w:t>
@@ -248,7 +248,7 @@
         <w:rPr>
           <w:rStyle w:val="VerbatimChar"/>
         </w:rPr>
-        <w:t xml:space="preserve">main</w:t>
+        <w:t xml:space="preserve">dev</w:t>
       </w:r>
       <w:r>
         <w:t xml:space="preserve">, minta satu reviewer.</w:t>
@@ -275,7 +275,16 @@
         <w:pStyle w:val="Compact"/>
       </w:pPr>
       <w:r>
-        <w:t xml:space="preserve">Branch</w:t>
+        <w:rPr>
+          <w:rStyle w:val="VerbatimChar"/>
+        </w:rPr>
+        <w:t xml:space="preserve">main</w:t>
+      </w:r>
+      <w:r>
+        <w:t xml:space="preserve"> </w:t>
+      </w:r>
+      <w:r>
+        <w:t xml:space="preserve">hanya menerima penggabungan</w:t>
       </w:r>
       <w:r>
         <w:t xml:space="preserve"> </w:t>
@@ -290,7 +299,7 @@
         <w:t xml:space="preserve"> </w:t>
       </w:r>
       <w:r>
-        <w:t xml:space="preserve">hanya untuk uji integrasi, tidak untuk menyimpan hasil akhir.</w:t>
+        <w:t xml:space="preserve">pada akhir milestone.</w:t>
       </w:r>
     </w:p>
     <w:bookmarkEnd w:id="20"/>
@@ -387,7 +396,7 @@
           <w:bCs/>
           <w:b/>
         </w:rPr>
-        <w:t xml:space="preserve">main</w:t>
+        <w:t xml:space="preserve">dev</w:t>
       </w:r>
       <w:r>
         <w:rPr>
@@ -413,7 +422,7 @@
         <w:rPr>
           <w:rStyle w:val="VerbatimChar"/>
         </w:rPr>
-        <w:t xml:space="preserve">dev</w:t>
+        <w:t xml:space="preserve">main</w:t>
       </w:r>
       <w:r>
         <w:t xml:space="preserve">, bukan dari</w:t>
@@ -471,7 +480,36 @@
         <w:pStyle w:val="Compact"/>
       </w:pPr>
       <w:r>
-        <w:t xml:space="preserve">Jangan push langsung ke</w:t>
+        <w:t xml:space="preserve">Pull Request mengarah ke</w:t>
+      </w:r>
+      <w:r>
+        <w:t xml:space="preserve"> </w:t>
+      </w:r>
+      <w:r>
+        <w:rPr>
+          <w:rStyle w:val="VerbatimChar"/>
+          <w:bCs/>
+          <w:b/>
+        </w:rPr>
+        <w:t xml:space="preserve">dev</w:t>
+      </w:r>
+      <w:r>
+        <w:t xml:space="preserve">. Jangan push langsung ke</w:t>
+      </w:r>
+      <w:r>
+        <w:t xml:space="preserve"> </w:t>
+      </w:r>
+      <w:r>
+        <w:rPr>
+          <w:rStyle w:val="VerbatimChar"/>
+        </w:rPr>
+        <w:t xml:space="preserve">dev</w:t>
+      </w:r>
+      <w:r>
+        <w:t xml:space="preserve"> </w:t>
+      </w:r>
+      <w:r>
+        <w:t xml:space="preserve">atau</w:t>
       </w:r>
       <w:r>
         <w:t xml:space="preserve"> </w:t>
@@ -484,27 +522,6 @@
       </w:r>
       <w:r>
         <w:t xml:space="preserve">.</w:t>
-      </w:r>
-      <w:r>
-        <w:t xml:space="preserve"> </w:t>
-      </w:r>
-      <w:r>
-        <w:rPr>
-          <w:rStyle w:val="VerbatimChar"/>
-        </w:rPr>
-        <w:t xml:space="preserve">dev</w:t>
-      </w:r>
-      <w:r>
-        <w:t xml:space="preserve"> </w:t>
-      </w:r>
-      <w:r>
-        <w:t xml:space="preserve">hanya untuk uji integrasi, bukan tempat</w:t>
-      </w:r>
-      <w:r>
-        <w:t xml:space="preserve"> </w:t>
-      </w:r>
-      <w:r>
-        <w:t xml:space="preserve">menyimpan hasil akhir.</w:t>
       </w:r>
     </w:p>
     <w:p>
@@ -1130,7 +1147,7 @@
               <w:rPr>
                 <w:rStyle w:val="VerbatimChar"/>
               </w:rPr>
-              <w:t xml:space="preserve">main</w:t>
+              <w:t xml:space="preserve">dev</w:t>
             </w:r>
           </w:p>
         </w:tc>
@@ -1221,7 +1238,7 @@
               <w:rPr>
                 <w:rStyle w:val="VerbatimChar"/>
               </w:rPr>
-              <w:t xml:space="preserve">main</w:t>
+              <w:t xml:space="preserve">dev</w:t>
             </w:r>
           </w:p>
         </w:tc>
@@ -1288,7 +1305,7 @@
               <w:rPr>
                 <w:rStyle w:val="VerbatimChar"/>
               </w:rPr>
-              <w:t xml:space="preserve">main</w:t>
+              <w:t xml:space="preserve">dev</w:t>
             </w:r>
           </w:p>
         </w:tc>
@@ -1341,7 +1358,7 @@
         <w:rPr>
           <w:rStyle w:val="VerbatimChar"/>
         </w:rPr>
-        <w:t xml:space="preserve">main</w:t>
+        <w:t xml:space="preserve">dev</w:t>
       </w:r>
       <w:r>
         <w:t xml:space="preserve">.</w:t>
@@ -1462,7 +1479,7 @@
               <w:rPr>
                 <w:rStyle w:val="VerbatimChar"/>
               </w:rPr>
-              <w:t xml:space="preserve">main</w:t>
+              <w:t xml:space="preserve">dev</w:t>
             </w:r>
           </w:p>
         </w:tc>
@@ -1529,7 +1546,7 @@
               <w:rPr>
                 <w:rStyle w:val="VerbatimChar"/>
               </w:rPr>
-              <w:t xml:space="preserve">main</w:t>
+              <w:t xml:space="preserve">dev</w:t>
             </w:r>
           </w:p>
         </w:tc>
@@ -1596,7 +1613,7 @@
               <w:rPr>
                 <w:rStyle w:val="VerbatimChar"/>
               </w:rPr>
-              <w:t xml:space="preserve">main</w:t>
+              <w:t xml:space="preserve">dev</w:t>
             </w:r>
           </w:p>
         </w:tc>
@@ -1747,7 +1764,7 @@
               <w:rPr>
                 <w:rStyle w:val="VerbatimChar"/>
               </w:rPr>
-              <w:t xml:space="preserve">main</w:t>
+              <w:t xml:space="preserve">dev</w:t>
             </w:r>
           </w:p>
         </w:tc>
@@ -1814,7 +1831,7 @@
               <w:rPr>
                 <w:rStyle w:val="VerbatimChar"/>
               </w:rPr>
-              <w:t xml:space="preserve">main</w:t>
+              <w:t xml:space="preserve">dev</w:t>
             </w:r>
           </w:p>
         </w:tc>
@@ -1869,7 +1886,7 @@
               <w:rPr>
                 <w:rStyle w:val="VerbatimChar"/>
               </w:rPr>
-              <w:t xml:space="preserve">main</w:t>
+              <w:t xml:space="preserve">dev</w:t>
             </w:r>
           </w:p>
         </w:tc>
@@ -1936,7 +1953,7 @@
               <w:rPr>
                 <w:rStyle w:val="VerbatimChar"/>
               </w:rPr>
-              <w:t xml:space="preserve">main</w:t>
+              <w:t xml:space="preserve">dev</w:t>
             </w:r>
           </w:p>
         </w:tc>
@@ -2003,7 +2020,7 @@
               <w:rPr>
                 <w:rStyle w:val="VerbatimChar"/>
               </w:rPr>
-              <w:t xml:space="preserve">main</w:t>
+              <w:t xml:space="preserve">dev</w:t>
             </w:r>
           </w:p>
         </w:tc>
@@ -2136,7 +2153,7 @@
               <w:rPr>
                 <w:rStyle w:val="VerbatimChar"/>
               </w:rPr>
-              <w:t xml:space="preserve">main</w:t>
+              <w:t xml:space="preserve">dev</w:t>
             </w:r>
           </w:p>
         </w:tc>
@@ -2227,7 +2244,7 @@
               <w:rPr>
                 <w:rStyle w:val="VerbatimChar"/>
               </w:rPr>
-              <w:t xml:space="preserve">main</w:t>
+              <w:t xml:space="preserve">dev</w:t>
             </w:r>
           </w:p>
         </w:tc>
@@ -2348,7 +2365,7 @@
               <w:rPr>
                 <w:rStyle w:val="VerbatimChar"/>
               </w:rPr>
-              <w:t xml:space="preserve">main</w:t>
+              <w:t xml:space="preserve">dev</w:t>
             </w:r>
           </w:p>
         </w:tc>
@@ -2415,7 +2432,7 @@
               <w:rPr>
                 <w:rStyle w:val="VerbatimChar"/>
               </w:rPr>
-              <w:t xml:space="preserve">main</w:t>
+              <w:t xml:space="preserve">dev</w:t>
             </w:r>
           </w:p>
         </w:tc>
@@ -2482,7 +2499,7 @@
               <w:rPr>
                 <w:rStyle w:val="VerbatimChar"/>
               </w:rPr>
-              <w:t xml:space="preserve">main</w:t>
+              <w:t xml:space="preserve">dev</w:t>
             </w:r>
           </w:p>
         </w:tc>
@@ -2805,7 +2822,7 @@
         <w:rPr>
           <w:rStyle w:val="NormalTok"/>
         </w:rPr>
-        <w:t xml:space="preserve"> switch main</w:t>
+        <w:t xml:space="preserve"> switch dev</w:t>
       </w:r>
       <w:r>
         <w:br/>
@@ -2820,7 +2837,7 @@
         <w:rPr>
           <w:rStyle w:val="NormalTok"/>
         </w:rPr>
-        <w:t xml:space="preserve"> pull origin main</w:t>
+        <w:t xml:space="preserve"> pull origin dev</w:t>
       </w:r>
       <w:r>
         <w:br/>
@@ -2882,7 +2899,19 @@
         <w:pStyle w:val="FirstParagraph"/>
       </w:pPr>
       <w:r>
-        <w:t xml:space="preserve">Setelah PR digabung:</w:t>
+        <w:t xml:space="preserve">Setelah PR digabung ke</w:t>
+      </w:r>
+      <w:r>
+        <w:t xml:space="preserve"> </w:t>
+      </w:r>
+      <w:r>
+        <w:rPr>
+          <w:rStyle w:val="VerbatimChar"/>
+        </w:rPr>
+        <w:t xml:space="preserve">dev</w:t>
+      </w:r>
+      <w:r>
+        <w:t xml:space="preserve">:</w:t>
       </w:r>
     </w:p>
     <w:p>
@@ -2899,7 +2928,7 @@
         <w:rPr>
           <w:rStyle w:val="NormalTok"/>
         </w:rPr>
-        <w:t xml:space="preserve"> switch main</w:t>
+        <w:t xml:space="preserve"> switch dev</w:t>
       </w:r>
       <w:r>
         <w:br/>
@@ -2914,7 +2943,7 @@
         <w:rPr>
           <w:rStyle w:val="NormalTok"/>
         </w:rPr>
-        <w:t xml:space="preserve"> pull origin main</w:t>
+        <w:t xml:space="preserve"> pull origin dev</w:t>
       </w:r>
       <w:r>
         <w:br/>
@@ -3059,7 +3088,7 @@
         <w:rPr>
           <w:rStyle w:val="NormalTok"/>
         </w:rPr>
-        <w:t xml:space="preserve"> switch main </w:t>
+        <w:t xml:space="preserve"> switch dev </w:t>
       </w:r>
       <w:r>
         <w:rPr>

</xml_diff>

<commit_message>
docs: tambah catatan Bisma tentang kontribusi di GitHub
</commit_message>
<xml_diff>
--- a/Pembagian Tugas/panduan-kerja-per-anggota.docx
+++ b/Pembagian Tugas/panduan-kerja-per-anggota.docx
@@ -43,7 +43,43 @@
     </w:p>
     <w:p>
       <w:pPr>
-        <w:pStyle w:val="BodyText"/>
+        <w:pStyle w:val="BlockText"/>
+      </w:pPr>
+      <w:r>
+        <w:rPr>
+          <w:bCs/>
+          <w:b/>
+        </w:rPr>
+        <w:t xml:space="preserve">CATATAN DARI BISMA</w:t>
+      </w:r>
+    </w:p>
+    <w:p>
+      <w:pPr>
+        <w:pStyle w:val="BlockText"/>
+      </w:pPr>
+      <w:r>
+        <w:rPr>
+          <w:bCs/>
+          <w:b/>
+        </w:rPr>
+        <w:t xml:space="preserve">JANGAN TAKUT SALAH PUSH, JANGAN TAKUT BIKIN KESALAHAN</w:t>
+      </w:r>
+    </w:p>
+    <w:p>
+      <w:pPr>
+        <w:pStyle w:val="BlockText"/>
+      </w:pPr>
+      <w:r>
+        <w:rPr>
+          <w:bCs/>
+          <w:b/>
+        </w:rPr>
+        <w:t xml:space="preserve">TAKUT KALAU KALIAN NGGAK ADA KONTRIBUSI DI GITHUB</w:t>
+      </w:r>
+    </w:p>
+    <w:p>
+      <w:pPr>
+        <w:pStyle w:val="FirstParagraph"/>
       </w:pPr>
       <w:r>
         <w:t xml:space="preserve">Dokumen ini menjelaskan, untuk setiap tugas: apa tujuannya, file apa yang dibuat,</w:t>

</xml_diff>